<commit_message>
Rewrite README in plain language with real-life examples; add practical implications to report
README now explains the idea, what was built, how it was tested, results with
real examples, real-life guidance, limits, repository map and how to run.
Report gains a short motivation sentence and a practical-implications paragraph
and stays at 12 pages.
</commit_message>
<xml_diff>
--- a/report/Prompt_Engineering_IS4143_Research_Report.docx
+++ b/report/Prompt_Engineering_IS4143_Research_Report.docx
@@ -478,7 +478,7 @@
           <w:rFonts w:ascii="Times New Roman" w:hAnsi="Times New Roman" w:eastAsia="Times New Roman"/>
           <w:sz w:val="24"/>
         </w:rPr>
-        <w:t>Reasoning tasks expose the weaknesses of both styles. A question such as a multi-step arithmetic word problem or a date calculation needs several intermediate inferences, and a model asked to answer in one step often fails. Wei et al. found that showing worked reasoning in the examples, known as chain-of-thought (CoT) prompting, greatly improves accuracy on such problems [2], and Kojima et al. showed that even the single phrase "Let's think step by step" can elicit this behaviour without any examples [3]. These findings suggest that two separate choices matter: whether the prompt contains examples, and whether the model is encouraged to reason aloud. Practitioners rarely see these two choices measured separately, and the cost of each in tokens and time is seldom reported.</w:t>
+        <w:t>Reasoning tasks expose the weaknesses of both styles. A question such as a multi-step arithmetic word problem or a date calculation needs several intermediate inferences, and a model asked to answer in one step often fails. Wei et al. found that showing worked reasoning in the examples, known as chain-of-thought (CoT) prompting, greatly improves accuracy on such problems [2], and Kojima et al. showed that even the single phrase "Let's think step by step" can elicit this behaviour without any examples [3]. These findings suggest that two separate choices matter: whether the prompt contains examples, and whether the model is encouraged to reason aloud. Practitioners rarely see these two choices measured separately, and the cost of each in tokens and time is seldom reported. This matters in practice: a customer-support bot that works out a refund, or a scheduling assistant that must compute a deadline, can succeed or fail depending only on how its prompt is written.</w:t>
       </w:r>
     </w:p>
     <w:p>
@@ -1260,7 +1260,7 @@
     </w:tbl>
     <w:p>
       <w:pPr>
-        <w:spacing w:line="240" w:lineRule="auto" w:after="40"/>
+        <w:spacing w:line="120" w:lineRule="exact" w:after="0"/>
       </w:pPr>
     </w:p>
     <w:p>
@@ -2324,7 +2324,7 @@
     </w:tbl>
     <w:p>
       <w:pPr>
-        <w:spacing w:line="240" w:lineRule="auto" w:after="40"/>
+        <w:spacing w:line="120" w:lineRule="exact" w:after="0"/>
       </w:pPr>
     </w:p>
     <w:p>
@@ -2392,7 +2392,7 @@
       <w:r>
         <w:drawing>
           <wp:inline xmlns:a="http://schemas.openxmlformats.org/drawingml/2006/main" xmlns:pic="http://schemas.openxmlformats.org/drawingml/2006/picture">
-            <wp:extent cx="3566160" cy="2037806"/>
+            <wp:extent cx="3017520" cy="1724297"/>
             <wp:docPr id="2" name="Picture 2"/>
             <wp:cNvGraphicFramePr>
               <a:graphicFrameLocks noChangeAspect="1"/>
@@ -2413,7 +2413,7 @@
                   <pic:spPr>
                     <a:xfrm>
                       <a:off x="0" y="0"/>
-                      <a:ext cx="3566160" cy="2037806"/>
+                      <a:ext cx="3017520" cy="1724297"/>
                     </a:xfrm>
                     <a:prstGeom prst="rect"/>
                   </pic:spPr>
@@ -2447,7 +2447,7 @@
       <w:r>
         <w:drawing>
           <wp:inline xmlns:a="http://schemas.openxmlformats.org/drawingml/2006/main" xmlns:pic="http://schemas.openxmlformats.org/drawingml/2006/picture">
-            <wp:extent cx="3566160" cy="2037806"/>
+            <wp:extent cx="3017520" cy="1724297"/>
             <wp:docPr id="3" name="Picture 3"/>
             <wp:cNvGraphicFramePr>
               <a:graphicFrameLocks noChangeAspect="1"/>
@@ -2468,7 +2468,7 @@
                   <pic:spPr>
                     <a:xfrm>
                       <a:off x="0" y="0"/>
-                      <a:ext cx="3566160" cy="2037806"/>
+                      <a:ext cx="3017520" cy="1724297"/>
                     </a:xfrm>
                     <a:prstGeom prst="rect"/>
                   </pic:spPr>
@@ -3015,7 +3015,7 @@
     </w:tbl>
     <w:p>
       <w:pPr>
-        <w:spacing w:line="240" w:lineRule="auto" w:after="40"/>
+        <w:spacing w:line="120" w:lineRule="exact" w:after="0"/>
       </w:pPr>
     </w:p>
     <w:p>
@@ -3785,7 +3785,7 @@
     </w:tbl>
     <w:p>
       <w:pPr>
-        <w:spacing w:line="240" w:lineRule="auto" w:after="40"/>
+        <w:spacing w:line="120" w:lineRule="exact" w:after="0"/>
       </w:pPr>
     </w:p>
     <w:p>
@@ -3808,7 +3808,7 @@
       <w:r>
         <w:drawing>
           <wp:inline xmlns:a="http://schemas.openxmlformats.org/drawingml/2006/main" xmlns:pic="http://schemas.openxmlformats.org/drawingml/2006/picture">
-            <wp:extent cx="3108960" cy="1969008"/>
+            <wp:extent cx="2651760" cy="1679448"/>
             <wp:docPr id="4" name="Picture 4"/>
             <wp:cNvGraphicFramePr>
               <a:graphicFrameLocks noChangeAspect="1"/>
@@ -3829,7 +3829,7 @@
                   <pic:spPr>
                     <a:xfrm>
                       <a:off x="0" y="0"/>
-                      <a:ext cx="3108960" cy="1969008"/>
+                      <a:ext cx="2651760" cy="1679448"/>
                     </a:xfrm>
                     <a:prstGeom prst="rect"/>
                   </pic:spPr>
@@ -3973,6 +3973,26 @@
           <w:sz w:val="24"/>
         </w:rPr>
         <w:t>The results answer the objectives as follows. (1) Eliciting reasoning matters far more than adding examples when the task needs multi-step computation: on GSM8K both CoT strategies lifted accuracy by 35-45 percentage points, while examples alone added little. (2) The benefit is task dependent, in line with the meta-analysis of Sprague et al. [14]: on the commonsense task StrategyQA there was no significant gain from any strategy. (3) Examples help in a different way: they fix the answer format and, combined with reasoning, make the reasoning shorter, which is why few-shot CoT dominated zero-shot CoT on Date Understanding and in cost. (4) The larger model was more accurate everywhere it was tested and made better use of reasoning on arithmetic (93-95% versus 47-57%), but its absolute gain from CoT was similar (about 40 points versus 35-45), so reasoning prompts help models of both sizes. These conclusions apply to the specific models, datasets and 60-question samples used here.</w:t>
+      </w:r>
+    </w:p>
+    <w:p>
+      <w:pPr>
+        <w:jc w:val="both"/>
+      </w:pPr>
+      <w:r>
+        <w:rPr>
+          <w:rFonts w:ascii="Times New Roman" w:hAnsi="Times New Roman" w:eastAsia="Times New Roman"/>
+          <w:b/>
+          <w:sz w:val="24"/>
+        </w:rPr>
+        <w:t>Practical implications.</w:t>
+      </w:r>
+      <w:r>
+        <w:rPr>
+          <w:rFonts w:ascii="Times New Roman" w:hAnsi="Times New Roman" w:eastAsia="Times New Roman"/>
+          <w:sz w:val="24"/>
+        </w:rPr>
+        <w:t xml:space="preserve"> For calculating applications such as a bill, refund or interest bot, the results support few-shot CoT: worked examples gave the highest GSM8K accuracy with short answers. For a date-scheduling assistant the examples also prevented the format failures seen with zero-shot CoT. For a yes/no knowledge bot a short plain prompt is likely enough, since no strategy was significantly better on StrategyQA, and a long "think step by step" prompt costs up to about 80 times more output. These are suggestions from two models and three task types, not general rules.</w:t>
       </w:r>
     </w:p>
     <w:p>
@@ -4153,20 +4173,7 @@
           <w:rFonts w:ascii="Times New Roman" w:hAnsi="Times New Roman" w:eastAsia="Times New Roman"/>
           <w:sz w:val="24"/>
         </w:rPr>
-        <w:t>•  Measure sensitivity to the choice and ordering of the in-context examples [15] and test automatically generated demonstrations [10].</w:t>
-      </w:r>
-    </w:p>
-    <w:p>
-      <w:pPr>
-        <w:ind w:left="576" w:hanging="360"/>
-        <w:jc w:val="both"/>
-      </w:pPr>
-      <w:r>
-        <w:rPr>
-          <w:rFonts w:ascii="Times New Roman" w:hAnsi="Times New Roman" w:eastAsia="Times New Roman"/>
-          <w:sz w:val="24"/>
-        </w:rPr>
-        <w:t>•  Include reasoning-native models, whose hidden reasoning may make prompt-level CoT unnecessary.</w:t>
+        <w:t>•  Measure sensitivity to the choice and order of the examples [15], test automatic demonstrations [10], and include reasoning-native models, whose hidden reasoning may make prompt-level CoT unnecessary.</w:t>
       </w:r>
     </w:p>
     <w:p>
@@ -4193,7 +4200,7 @@
           <w:rFonts w:ascii="Times New Roman" w:hAnsi="Times New Roman" w:eastAsia="Times New Roman"/>
           <w:sz w:val="24"/>
         </w:rPr>
-        <w:t>This project compared zero-shot, zero-shot CoT, few-shot and few-shot CoT prompting on arithmetic, commonsense and temporal reasoning with two open-weight models. Chain-of-thought reasoning was the dominant factor for arithmetic: it raised GSM8K accuracy from 11.7% to as much as 56.7% for ALLaM-2-7B and from 53.3% to as much as 95.0% for Qwen3.8-27B, a significant gain in every case (p &lt; 0.001), whereas few-shot examples alone gave no significant gain. On StrategyQA no strategy was significantly better than another. Few-shot CoT was the most reliable overall: it had the highest accuracy in three of the five model-dataset settings (GSM8K for both models and Date Understanding), was within sampling error of the best on StrategyQA, avoided answer-format failures, and needed fewer output tokens than zero-shot CoT. The practical recommendation is to use few-shot CoT for computation-heavy tasks and plain prompts for knowledge-based questions. The limitations above, chiefly the small samples and the incomplete Qwen runs, mean these findings should be confirmed on larger samples. All code, prompts and raw outputs are in the project repository so the experiments can be reproduced.</w:t>
+        <w:t>This project compared zero-shot, zero-shot CoT, few-shot and few-shot CoT prompting on arithmetic, commonsense and temporal reasoning with two open-weight models. Chain-of-thought reasoning was the dominant factor for arithmetic: it raised GSM8K accuracy from 11.7% to as much as 56.7% for ALLaM-2-7B and from 53.3% to as much as 95.0% for Qwen3.8-27B, a significant gain in every case (p &lt; 0.001), whereas few-shot examples alone gave no significant gain. On StrategyQA no strategy was significantly better than another. Few-shot CoT was the most reliable overall: it had the highest accuracy in three of the five model-dataset settings (GSM8K for both models and Date Understanding), was within sampling error of the best on StrategyQA, avoided answer-format failures, and needed fewer output tokens than zero-shot CoT. The practical recommendation is to use few-shot CoT for computation-heavy tasks and plain prompts for knowledge-based questions. Because of the small samples and the incomplete Qwen runs, these findings should be confirmed on larger samples; all code, prompts and raw outputs are in the project repository.</w:t>
       </w:r>
     </w:p>
     <w:p>
@@ -4213,7 +4220,7 @@
     </w:p>
     <w:p>
       <w:pPr>
-        <w:spacing w:line="276" w:lineRule="auto" w:after="60"/>
+        <w:spacing w:line="240" w:lineRule="auto" w:after="40"/>
         <w:ind w:left="648" w:hanging="648"/>
         <w:jc w:val="both"/>
       </w:pPr>
@@ -4227,7 +4234,7 @@
     </w:p>
     <w:p>
       <w:pPr>
-        <w:spacing w:line="276" w:lineRule="auto" w:after="60"/>
+        <w:spacing w:line="240" w:lineRule="auto" w:after="40"/>
         <w:ind w:left="648" w:hanging="648"/>
         <w:jc w:val="both"/>
       </w:pPr>
@@ -4241,7 +4248,7 @@
     </w:p>
     <w:p>
       <w:pPr>
-        <w:spacing w:line="276" w:lineRule="auto" w:after="60"/>
+        <w:spacing w:line="240" w:lineRule="auto" w:after="40"/>
         <w:ind w:left="648" w:hanging="648"/>
         <w:jc w:val="both"/>
       </w:pPr>
@@ -4255,7 +4262,7 @@
     </w:p>
     <w:p>
       <w:pPr>
-        <w:spacing w:line="276" w:lineRule="auto" w:after="60"/>
+        <w:spacing w:line="240" w:lineRule="auto" w:after="40"/>
         <w:ind w:left="648" w:hanging="648"/>
         <w:jc w:val="both"/>
       </w:pPr>
@@ -4269,7 +4276,7 @@
     </w:p>
     <w:p>
       <w:pPr>
-        <w:spacing w:line="276" w:lineRule="auto" w:after="60"/>
+        <w:spacing w:line="240" w:lineRule="auto" w:after="40"/>
         <w:ind w:left="648" w:hanging="648"/>
         <w:jc w:val="both"/>
       </w:pPr>
@@ -4283,7 +4290,7 @@
     </w:p>
     <w:p>
       <w:pPr>
-        <w:spacing w:line="276" w:lineRule="auto" w:after="60"/>
+        <w:spacing w:line="240" w:lineRule="auto" w:after="40"/>
         <w:ind w:left="648" w:hanging="648"/>
         <w:jc w:val="both"/>
       </w:pPr>
@@ -4297,7 +4304,7 @@
     </w:p>
     <w:p>
       <w:pPr>
-        <w:spacing w:line="276" w:lineRule="auto" w:after="60"/>
+        <w:spacing w:line="240" w:lineRule="auto" w:after="40"/>
         <w:ind w:left="648" w:hanging="648"/>
         <w:jc w:val="both"/>
       </w:pPr>
@@ -4311,7 +4318,7 @@
     </w:p>
     <w:p>
       <w:pPr>
-        <w:spacing w:line="276" w:lineRule="auto" w:after="60"/>
+        <w:spacing w:line="240" w:lineRule="auto" w:after="40"/>
         <w:ind w:left="648" w:hanging="648"/>
         <w:jc w:val="both"/>
       </w:pPr>
@@ -4325,7 +4332,7 @@
     </w:p>
     <w:p>
       <w:pPr>
-        <w:spacing w:line="276" w:lineRule="auto" w:after="60"/>
+        <w:spacing w:line="240" w:lineRule="auto" w:after="40"/>
         <w:ind w:left="648" w:hanging="648"/>
         <w:jc w:val="both"/>
       </w:pPr>
@@ -4339,7 +4346,7 @@
     </w:p>
     <w:p>
       <w:pPr>
-        <w:spacing w:line="276" w:lineRule="auto" w:after="60"/>
+        <w:spacing w:line="240" w:lineRule="auto" w:after="40"/>
         <w:ind w:left="648" w:hanging="648"/>
         <w:jc w:val="both"/>
       </w:pPr>
@@ -4353,7 +4360,7 @@
     </w:p>
     <w:p>
       <w:pPr>
-        <w:spacing w:line="276" w:lineRule="auto" w:after="60"/>
+        <w:spacing w:line="240" w:lineRule="auto" w:after="40"/>
         <w:ind w:left="648" w:hanging="648"/>
         <w:jc w:val="both"/>
       </w:pPr>
@@ -4367,7 +4374,7 @@
     </w:p>
     <w:p>
       <w:pPr>
-        <w:spacing w:line="276" w:lineRule="auto" w:after="60"/>
+        <w:spacing w:line="240" w:lineRule="auto" w:after="40"/>
         <w:ind w:left="648" w:hanging="648"/>
         <w:jc w:val="both"/>
       </w:pPr>
@@ -4381,7 +4388,7 @@
     </w:p>
     <w:p>
       <w:pPr>
-        <w:spacing w:line="276" w:lineRule="auto" w:after="60"/>
+        <w:spacing w:line="240" w:lineRule="auto" w:after="40"/>
         <w:ind w:left="648" w:hanging="648"/>
         <w:jc w:val="both"/>
       </w:pPr>
@@ -4395,7 +4402,7 @@
     </w:p>
     <w:p>
       <w:pPr>
-        <w:spacing w:line="276" w:lineRule="auto" w:after="60"/>
+        <w:spacing w:line="240" w:lineRule="auto" w:after="40"/>
         <w:ind w:left="648" w:hanging="648"/>
         <w:jc w:val="both"/>
       </w:pPr>
@@ -4409,7 +4416,7 @@
     </w:p>
     <w:p>
       <w:pPr>
-        <w:spacing w:line="276" w:lineRule="auto" w:after="60"/>
+        <w:spacing w:line="240" w:lineRule="auto" w:after="40"/>
         <w:ind w:left="648" w:hanging="648"/>
         <w:jc w:val="both"/>
       </w:pPr>
@@ -4423,7 +4430,7 @@
     </w:p>
     <w:p>
       <w:pPr>
-        <w:spacing w:line="276" w:lineRule="auto" w:after="60"/>
+        <w:spacing w:line="240" w:lineRule="auto" w:after="40"/>
         <w:ind w:left="648" w:hanging="648"/>
         <w:jc w:val="both"/>
       </w:pPr>
@@ -4437,7 +4444,7 @@
     </w:p>
     <w:p>
       <w:pPr>
-        <w:spacing w:line="276" w:lineRule="auto" w:after="60"/>
+        <w:spacing w:line="240" w:lineRule="auto" w:after="40"/>
         <w:ind w:left="648" w:hanging="648"/>
         <w:jc w:val="both"/>
       </w:pPr>

</xml_diff>